<commit_message>
Shifting to VS code and antigravity
</commit_message>
<xml_diff>
--- a/flutter_documents/flutter_more_documents/f52_flutter_flavors_in_deployment.docx
+++ b/flutter_documents/flutter_more_documents/f52_flutter_flavors_in_deployment.docx
@@ -21233,17 +21233,7 @@
           <w:sz w:val="32"/>
           <w:szCs w:val="32"/>
         </w:rPr>
-        <w:t xml:space="preserve">    </w:t>
-      </w:r>
-      <w:r>
-        <w:rPr>
-          <w:b/>
-          <w:bCs/>
-          <w:color w:val="D86DCB" w:themeColor="accent5" w:themeTint="99"/>
-          <w:sz w:val="32"/>
-          <w:szCs w:val="32"/>
-        </w:rPr>
-        <w:t>…</w:t>
+        <w:t xml:space="preserve">    …</w:t>
       </w:r>
     </w:p>
     <w:p>
@@ -21521,17 +21511,7 @@
           <w:sz w:val="32"/>
           <w:szCs w:val="32"/>
         </w:rPr>
-        <w:t>")</w:t>
-      </w:r>
-      <w:r>
-        <w:rPr>
-          <w:b/>
-          <w:bCs/>
-          <w:color w:val="D86DCB" w:themeColor="accent5" w:themeTint="99"/>
-          <w:sz w:val="32"/>
-          <w:szCs w:val="32"/>
-        </w:rPr>
-        <w:t xml:space="preserve">  /</w:t>
+        <w:t>")  /</w:t>
       </w:r>
       <w:proofErr w:type="gramEnd"/>
       <w:r>
@@ -22551,17 +22531,7 @@
           <w:sz w:val="32"/>
           <w:szCs w:val="32"/>
         </w:rPr>
-        <w:t xml:space="preserve">        </w:t>
-      </w:r>
-      <w:r>
-        <w:rPr>
-          <w:b/>
-          <w:bCs/>
-          <w:color w:val="D86DCB" w:themeColor="accent5" w:themeTint="99"/>
-          <w:sz w:val="32"/>
-          <w:szCs w:val="32"/>
-        </w:rPr>
-        <w:t>…</w:t>
+        <w:t xml:space="preserve">        …</w:t>
       </w:r>
     </w:p>
     <w:p>
@@ -23191,16 +23161,7 @@
           <w:sz w:val="32"/>
           <w:szCs w:val="32"/>
         </w:rPr>
-        <w:t>…/</w:t>
-      </w:r>
-      <w:r>
-        <w:rPr>
-          <w:b/>
-          <w:bCs/>
-          <w:sz w:val="32"/>
-          <w:szCs w:val="32"/>
-        </w:rPr>
-        <w:t>mipmap-</w:t>
+        <w:t>…/mipmap-</w:t>
       </w:r>
       <w:proofErr w:type="spellStart"/>
       <w:r>
@@ -23245,16 +23206,7 @@
           <w:sz w:val="32"/>
           <w:szCs w:val="32"/>
         </w:rPr>
-        <w:t>…/</w:t>
-      </w:r>
-      <w:r>
-        <w:rPr>
-          <w:b/>
-          <w:bCs/>
-          <w:sz w:val="32"/>
-          <w:szCs w:val="32"/>
-        </w:rPr>
-        <w:t>mipmap-</w:t>
+        <w:t>…/mipmap-</w:t>
       </w:r>
       <w:proofErr w:type="spellStart"/>
       <w:r>
@@ -23299,16 +23251,7 @@
           <w:sz w:val="32"/>
           <w:szCs w:val="32"/>
         </w:rPr>
-        <w:t>…/</w:t>
-      </w:r>
-      <w:r>
-        <w:rPr>
-          <w:b/>
-          <w:bCs/>
-          <w:sz w:val="32"/>
-          <w:szCs w:val="32"/>
-        </w:rPr>
-        <w:t>mipmap-</w:t>
+        <w:t>…/mipmap-</w:t>
       </w:r>
       <w:proofErr w:type="spellStart"/>
       <w:r>
@@ -23353,298 +23296,289 @@
           <w:sz w:val="32"/>
           <w:szCs w:val="32"/>
         </w:rPr>
+        <w:t>…/mipmap-</w:t>
+      </w:r>
+      <w:proofErr w:type="spellStart"/>
+      <w:r>
+        <w:rPr>
+          <w:b/>
+          <w:bCs/>
+          <w:sz w:val="32"/>
+          <w:szCs w:val="32"/>
+        </w:rPr>
+        <w:t>xxxhdpi</w:t>
+      </w:r>
+      <w:proofErr w:type="spellEnd"/>
+      <w:r>
+        <w:rPr>
+          <w:b/>
+          <w:bCs/>
+          <w:sz w:val="32"/>
+          <w:szCs w:val="32"/>
+        </w:rPr>
+        <w:t>/ic_launcher.png</w:t>
+      </w:r>
+    </w:p>
+    <w:p>
+      <w:pPr>
+        <w:jc w:val="both"/>
+        <w:rPr>
+          <w:sz w:val="32"/>
+          <w:szCs w:val="32"/>
+        </w:rPr>
+      </w:pPr>
+      <w:r>
+        <w:rPr>
+          <w:sz w:val="32"/>
+          <w:szCs w:val="32"/>
+        </w:rPr>
+        <w:t xml:space="preserve"># Same pattern for </w:t>
+      </w:r>
+      <w:r>
+        <w:rPr>
+          <w:b/>
+          <w:bCs/>
+          <w:sz w:val="32"/>
+          <w:szCs w:val="32"/>
+        </w:rPr>
+        <w:t>production/res</w:t>
+      </w:r>
+      <w:r>
+        <w:rPr>
+          <w:sz w:val="32"/>
+          <w:szCs w:val="32"/>
+        </w:rPr>
+        <w:t xml:space="preserve">. IMPORTANT, </w:t>
+      </w:r>
+      <w:r>
+        <w:rPr>
+          <w:sz w:val="32"/>
+          <w:szCs w:val="32"/>
+        </w:rPr>
+        <w:t xml:space="preserve">every icon file, regardless of </w:t>
+      </w:r>
+      <w:r>
+        <w:rPr>
+          <w:sz w:val="32"/>
+          <w:szCs w:val="32"/>
+        </w:rPr>
+        <w:t>F</w:t>
+      </w:r>
+      <w:r>
+        <w:rPr>
+          <w:sz w:val="32"/>
+          <w:szCs w:val="32"/>
+        </w:rPr>
+        <w:t xml:space="preserve">lavor or density, must be renamed to exactly </w:t>
+      </w:r>
+      <w:r>
+        <w:rPr>
+          <w:b/>
+          <w:bCs/>
+          <w:sz w:val="32"/>
+          <w:szCs w:val="32"/>
+        </w:rPr>
+        <w:t>ic_launcher.png</w:t>
+      </w:r>
+      <w:r>
+        <w:rPr>
+          <w:sz w:val="32"/>
+          <w:szCs w:val="32"/>
+        </w:rPr>
+        <w:t xml:space="preserve"> in its respective folder. The </w:t>
+      </w:r>
+      <w:r>
+        <w:rPr>
+          <w:sz w:val="32"/>
+          <w:szCs w:val="32"/>
+        </w:rPr>
+        <w:t>F</w:t>
+      </w:r>
+      <w:r>
+        <w:rPr>
+          <w:sz w:val="32"/>
+          <w:szCs w:val="32"/>
+        </w:rPr>
+        <w:t>lavor distinction comes entirely from the folder path (</w:t>
+      </w:r>
+      <w:proofErr w:type="spellStart"/>
+      <w:r>
+        <w:rPr>
+          <w:b/>
+          <w:bCs/>
+          <w:sz w:val="32"/>
+          <w:szCs w:val="32"/>
+        </w:rPr>
+        <w:t>src</w:t>
+      </w:r>
+      <w:proofErr w:type="spellEnd"/>
+      <w:r>
+        <w:rPr>
+          <w:b/>
+          <w:bCs/>
+          <w:sz w:val="32"/>
+          <w:szCs w:val="32"/>
+        </w:rPr>
+        <w:t>/staging/res/..</w:t>
+      </w:r>
+      <w:r>
+        <w:rPr>
+          <w:sz w:val="32"/>
+          <w:szCs w:val="32"/>
+        </w:rPr>
+        <w:t xml:space="preserve">. vs </w:t>
+      </w:r>
+      <w:proofErr w:type="spellStart"/>
+      <w:r>
+        <w:rPr>
+          <w:b/>
+          <w:bCs/>
+          <w:sz w:val="32"/>
+          <w:szCs w:val="32"/>
+        </w:rPr>
+        <w:t>src</w:t>
+      </w:r>
+      <w:proofErr w:type="spellEnd"/>
+      <w:r>
+        <w:rPr>
+          <w:b/>
+          <w:bCs/>
+          <w:sz w:val="32"/>
+          <w:szCs w:val="32"/>
+        </w:rPr>
+        <w:t>/production/res/...</w:t>
+      </w:r>
+      <w:r>
+        <w:rPr>
+          <w:sz w:val="32"/>
+          <w:szCs w:val="32"/>
+        </w:rPr>
+        <w:t>), not from the filename.</w:t>
+      </w:r>
+    </w:p>
+    <w:p>
+      <w:pPr>
+        <w:jc w:val="both"/>
+        <w:rPr>
+          <w:sz w:val="32"/>
+          <w:szCs w:val="32"/>
+        </w:rPr>
+      </w:pPr>
+    </w:p>
+    <w:p>
+      <w:pPr>
+        <w:jc w:val="both"/>
+        <w:rPr>
+          <w:sz w:val="32"/>
+          <w:szCs w:val="32"/>
+        </w:rPr>
+      </w:pPr>
+      <w:r>
+        <w:rPr>
+          <w:sz w:val="32"/>
+          <w:szCs w:val="32"/>
+        </w:rPr>
+        <w:t xml:space="preserve"># Step-3, Confirm the manifest references the generic name. </w:t>
+      </w:r>
+      <w:r>
+        <w:rPr>
+          <w:sz w:val="32"/>
+          <w:szCs w:val="32"/>
+        </w:rPr>
+        <w:t xml:space="preserve">Gradle's source-set merging automatically picks the icon from the active </w:t>
+      </w:r>
+      <w:r>
+        <w:rPr>
+          <w:sz w:val="32"/>
+          <w:szCs w:val="32"/>
+        </w:rPr>
+        <w:t>F</w:t>
+      </w:r>
+      <w:r>
+        <w:rPr>
+          <w:sz w:val="32"/>
+          <w:szCs w:val="32"/>
+        </w:rPr>
+        <w:t>lavor's</w:t>
+      </w:r>
+      <w:r>
+        <w:rPr>
+          <w:b/>
+          <w:bCs/>
+          <w:sz w:val="32"/>
+          <w:szCs w:val="32"/>
+        </w:rPr>
+        <w:t xml:space="preserve"> </w:t>
+      </w:r>
+      <w:proofErr w:type="spellStart"/>
+      <w:r>
+        <w:rPr>
+          <w:b/>
+          <w:bCs/>
+          <w:sz w:val="32"/>
+          <w:szCs w:val="32"/>
+        </w:rPr>
+        <w:t>src</w:t>
+      </w:r>
+      <w:proofErr w:type="spellEnd"/>
+      <w:r>
+        <w:rPr>
+          <w:b/>
+          <w:bCs/>
+          <w:sz w:val="32"/>
+          <w:szCs w:val="32"/>
+        </w:rPr>
+        <w:t>/&lt;flavor&gt;/res/</w:t>
+      </w:r>
+      <w:r>
+        <w:rPr>
+          <w:sz w:val="32"/>
+          <w:szCs w:val="32"/>
+        </w:rPr>
+        <w:t xml:space="preserve"> folder and overlays it onto </w:t>
+      </w:r>
+      <w:proofErr w:type="spellStart"/>
+      <w:r>
+        <w:rPr>
+          <w:b/>
+          <w:bCs/>
+          <w:sz w:val="32"/>
+          <w:szCs w:val="32"/>
+        </w:rPr>
+        <w:t>src</w:t>
+      </w:r>
+      <w:proofErr w:type="spellEnd"/>
+      <w:r>
+        <w:rPr>
+          <w:b/>
+          <w:bCs/>
+          <w:sz w:val="32"/>
+          <w:szCs w:val="32"/>
+        </w:rPr>
+        <w:t>/main/res/</w:t>
+      </w:r>
+    </w:p>
+    <w:p>
+      <w:pPr>
+        <w:jc w:val="both"/>
+        <w:rPr>
+          <w:b/>
+          <w:bCs/>
+          <w:color w:val="D86DCB" w:themeColor="accent5" w:themeTint="99"/>
+          <w:sz w:val="32"/>
+          <w:szCs w:val="32"/>
+        </w:rPr>
+      </w:pPr>
+      <w:r>
+        <w:rPr>
+          <w:b/>
+          <w:bCs/>
+          <w:color w:val="D86DCB" w:themeColor="accent5" w:themeTint="99"/>
+          <w:sz w:val="32"/>
+          <w:szCs w:val="32"/>
+        </w:rPr>
         <w:t>…</w:t>
       </w:r>
-      <w:r>
-        <w:rPr>
-          <w:b/>
-          <w:bCs/>
-          <w:sz w:val="32"/>
-          <w:szCs w:val="32"/>
-        </w:rPr>
-        <w:t>/mipmap-</w:t>
-      </w:r>
-      <w:proofErr w:type="spellStart"/>
-      <w:r>
-        <w:rPr>
-          <w:b/>
-          <w:bCs/>
-          <w:sz w:val="32"/>
-          <w:szCs w:val="32"/>
-        </w:rPr>
-        <w:t>xxxhdpi</w:t>
-      </w:r>
-      <w:proofErr w:type="spellEnd"/>
-      <w:r>
-        <w:rPr>
-          <w:b/>
-          <w:bCs/>
-          <w:sz w:val="32"/>
-          <w:szCs w:val="32"/>
-        </w:rPr>
-        <w:t>/ic_launcher.png</w:t>
-      </w:r>
-    </w:p>
-    <w:p>
-      <w:pPr>
-        <w:jc w:val="both"/>
-        <w:rPr>
-          <w:sz w:val="32"/>
-          <w:szCs w:val="32"/>
-        </w:rPr>
-      </w:pPr>
-      <w:r>
-        <w:rPr>
-          <w:sz w:val="32"/>
-          <w:szCs w:val="32"/>
-        </w:rPr>
-        <w:t xml:space="preserve"># Same pattern for </w:t>
-      </w:r>
-      <w:r>
-        <w:rPr>
-          <w:b/>
-          <w:bCs/>
-          <w:sz w:val="32"/>
-          <w:szCs w:val="32"/>
-        </w:rPr>
-        <w:t>production/res</w:t>
-      </w:r>
-      <w:r>
-        <w:rPr>
-          <w:sz w:val="32"/>
-          <w:szCs w:val="32"/>
-        </w:rPr>
-        <w:t xml:space="preserve">. IMPORTANT, </w:t>
-      </w:r>
-      <w:r>
-        <w:rPr>
-          <w:sz w:val="32"/>
-          <w:szCs w:val="32"/>
-        </w:rPr>
-        <w:t xml:space="preserve">every icon file, regardless of </w:t>
-      </w:r>
-      <w:r>
-        <w:rPr>
-          <w:sz w:val="32"/>
-          <w:szCs w:val="32"/>
-        </w:rPr>
-        <w:t>F</w:t>
-      </w:r>
-      <w:r>
-        <w:rPr>
-          <w:sz w:val="32"/>
-          <w:szCs w:val="32"/>
-        </w:rPr>
-        <w:t xml:space="preserve">lavor or density, must be renamed to exactly </w:t>
-      </w:r>
-      <w:r>
-        <w:rPr>
-          <w:b/>
-          <w:bCs/>
-          <w:sz w:val="32"/>
-          <w:szCs w:val="32"/>
-        </w:rPr>
-        <w:t>ic_launcher.png</w:t>
-      </w:r>
-      <w:r>
-        <w:rPr>
-          <w:sz w:val="32"/>
-          <w:szCs w:val="32"/>
-        </w:rPr>
-        <w:t xml:space="preserve"> in its respective folder. The </w:t>
-      </w:r>
-      <w:r>
-        <w:rPr>
-          <w:sz w:val="32"/>
-          <w:szCs w:val="32"/>
-        </w:rPr>
-        <w:t>F</w:t>
-      </w:r>
-      <w:r>
-        <w:rPr>
-          <w:sz w:val="32"/>
-          <w:szCs w:val="32"/>
-        </w:rPr>
-        <w:t>lavor distinction comes entirely from the folder path (</w:t>
-      </w:r>
-      <w:proofErr w:type="spellStart"/>
-      <w:r>
-        <w:rPr>
-          <w:b/>
-          <w:bCs/>
-          <w:sz w:val="32"/>
-          <w:szCs w:val="32"/>
-        </w:rPr>
-        <w:t>src</w:t>
-      </w:r>
-      <w:proofErr w:type="spellEnd"/>
-      <w:r>
-        <w:rPr>
-          <w:b/>
-          <w:bCs/>
-          <w:sz w:val="32"/>
-          <w:szCs w:val="32"/>
-        </w:rPr>
-        <w:t>/staging/res/..</w:t>
-      </w:r>
-      <w:r>
-        <w:rPr>
-          <w:sz w:val="32"/>
-          <w:szCs w:val="32"/>
-        </w:rPr>
-        <w:t xml:space="preserve">. vs </w:t>
-      </w:r>
-      <w:proofErr w:type="spellStart"/>
-      <w:r>
-        <w:rPr>
-          <w:b/>
-          <w:bCs/>
-          <w:sz w:val="32"/>
-          <w:szCs w:val="32"/>
-        </w:rPr>
-        <w:t>src</w:t>
-      </w:r>
-      <w:proofErr w:type="spellEnd"/>
-      <w:r>
-        <w:rPr>
-          <w:b/>
-          <w:bCs/>
-          <w:sz w:val="32"/>
-          <w:szCs w:val="32"/>
-        </w:rPr>
-        <w:t>/production/res/...</w:t>
-      </w:r>
-      <w:r>
-        <w:rPr>
-          <w:sz w:val="32"/>
-          <w:szCs w:val="32"/>
-        </w:rPr>
-        <w:t>), not from the filename.</w:t>
-      </w:r>
-    </w:p>
-    <w:p>
-      <w:pPr>
-        <w:jc w:val="both"/>
-        <w:rPr>
-          <w:sz w:val="32"/>
-          <w:szCs w:val="32"/>
-        </w:rPr>
-      </w:pPr>
-    </w:p>
-    <w:p>
-      <w:pPr>
-        <w:jc w:val="both"/>
-        <w:rPr>
-          <w:sz w:val="32"/>
-          <w:szCs w:val="32"/>
-        </w:rPr>
-      </w:pPr>
-      <w:r>
-        <w:rPr>
-          <w:sz w:val="32"/>
-          <w:szCs w:val="32"/>
-        </w:rPr>
-        <w:t xml:space="preserve"># Step-3, Confirm the manifest references the generic name. </w:t>
-      </w:r>
-      <w:r>
-        <w:rPr>
-          <w:sz w:val="32"/>
-          <w:szCs w:val="32"/>
-        </w:rPr>
-        <w:t xml:space="preserve">Gradle's source-set merging automatically picks the icon from the active </w:t>
-      </w:r>
-      <w:r>
-        <w:rPr>
-          <w:sz w:val="32"/>
-          <w:szCs w:val="32"/>
-        </w:rPr>
-        <w:t>F</w:t>
-      </w:r>
-      <w:r>
-        <w:rPr>
-          <w:sz w:val="32"/>
-          <w:szCs w:val="32"/>
-        </w:rPr>
-        <w:t>lavor's</w:t>
-      </w:r>
-      <w:r>
-        <w:rPr>
-          <w:b/>
-          <w:bCs/>
-          <w:sz w:val="32"/>
-          <w:szCs w:val="32"/>
-        </w:rPr>
-        <w:t xml:space="preserve"> </w:t>
-      </w:r>
-      <w:proofErr w:type="spellStart"/>
-      <w:r>
-        <w:rPr>
-          <w:b/>
-          <w:bCs/>
-          <w:sz w:val="32"/>
-          <w:szCs w:val="32"/>
-        </w:rPr>
-        <w:t>src</w:t>
-      </w:r>
-      <w:proofErr w:type="spellEnd"/>
-      <w:r>
-        <w:rPr>
-          <w:b/>
-          <w:bCs/>
-          <w:sz w:val="32"/>
-          <w:szCs w:val="32"/>
-        </w:rPr>
-        <w:t>/&lt;flavor&gt;/res/</w:t>
-      </w:r>
-      <w:r>
-        <w:rPr>
-          <w:sz w:val="32"/>
-          <w:szCs w:val="32"/>
-        </w:rPr>
-        <w:t xml:space="preserve"> folder and overlays it onto </w:t>
-      </w:r>
-      <w:proofErr w:type="spellStart"/>
-      <w:r>
-        <w:rPr>
-          <w:b/>
-          <w:bCs/>
-          <w:sz w:val="32"/>
-          <w:szCs w:val="32"/>
-        </w:rPr>
-        <w:t>src</w:t>
-      </w:r>
-      <w:proofErr w:type="spellEnd"/>
-      <w:r>
-        <w:rPr>
-          <w:b/>
-          <w:bCs/>
-          <w:sz w:val="32"/>
-          <w:szCs w:val="32"/>
-        </w:rPr>
-        <w:t>/main/res/</w:t>
-      </w:r>
-    </w:p>
-    <w:p>
-      <w:pPr>
-        <w:jc w:val="both"/>
-        <w:rPr>
-          <w:b/>
-          <w:bCs/>
-          <w:color w:val="D86DCB" w:themeColor="accent5" w:themeTint="99"/>
-          <w:sz w:val="32"/>
-          <w:szCs w:val="32"/>
-        </w:rPr>
-      </w:pPr>
-      <w:r>
-        <w:rPr>
-          <w:b/>
-          <w:bCs/>
-          <w:color w:val="D86DCB" w:themeColor="accent5" w:themeTint="99"/>
-          <w:sz w:val="32"/>
-          <w:szCs w:val="32"/>
-        </w:rPr>
-        <w:t>…</w:t>
-      </w:r>
     </w:p>
     <w:p>
       <w:pPr>
@@ -23687,17 +23621,7 @@
           <w:sz w:val="32"/>
           <w:szCs w:val="32"/>
         </w:rPr>
-        <w:t xml:space="preserve">  </w:t>
-      </w:r>
-      <w:r>
-        <w:rPr>
-          <w:b/>
-          <w:bCs/>
-          <w:color w:val="D86DCB" w:themeColor="accent5" w:themeTint="99"/>
-          <w:sz w:val="32"/>
-          <w:szCs w:val="32"/>
-        </w:rPr>
-        <w:t>…</w:t>
+        <w:t xml:space="preserve">  …</w:t>
       </w:r>
     </w:p>
     <w:p>
@@ -23925,28 +23849,7 @@
           <w:sz w:val="32"/>
           <w:szCs w:val="32"/>
         </w:rPr>
-        <w:t xml:space="preserve"> included) touches platform channels</w:t>
-      </w:r>
-      <w:r>
-        <w:rPr>
-          <w:sz w:val="32"/>
-          <w:szCs w:val="32"/>
-        </w:rPr>
-        <w:t>,</w:t>
-      </w:r>
-      <w:r>
-        <w:rPr>
-          <w:sz w:val="32"/>
-          <w:szCs w:val="32"/>
-        </w:rPr>
-        <w:t xml:space="preserve"> this is non-negotiable, always the first</w:t>
-      </w:r>
-      <w:r>
-        <w:rPr>
-          <w:sz w:val="32"/>
-          <w:szCs w:val="32"/>
-        </w:rPr>
-        <w:t xml:space="preserve"> when </w:t>
+        <w:t xml:space="preserve"> included) touches platform channels, this is non-negotiable, always the first when </w:t>
       </w:r>
       <w:r>
         <w:rPr>
@@ -24010,21 +23913,7 @@
           <w:sz w:val="32"/>
           <w:szCs w:val="32"/>
         </w:rPr>
-        <w:t>Notice</w:t>
-      </w:r>
-      <w:r>
-        <w:rPr>
-          <w:sz w:val="32"/>
-          <w:szCs w:val="32"/>
-        </w:rPr>
-        <w:t xml:space="preserve"> the</w:t>
-      </w:r>
-      <w:r>
-        <w:rPr>
-          <w:sz w:val="32"/>
-          <w:szCs w:val="32"/>
-        </w:rPr>
-        <w:t xml:space="preserve"> </w:t>
+        <w:t xml:space="preserve">Notice the </w:t>
       </w:r>
       <w:proofErr w:type="spellStart"/>
       <w:proofErr w:type="gramStart"/>
@@ -24044,14 +23933,7 @@
           <w:sz w:val="32"/>
           <w:szCs w:val="32"/>
         </w:rPr>
-        <w:t>, now</w:t>
-      </w:r>
-      <w:r>
-        <w:rPr>
-          <w:sz w:val="32"/>
-          <w:szCs w:val="32"/>
-        </w:rPr>
-        <w:t xml:space="preserve"> </w:t>
+        <w:t xml:space="preserve">, now </w:t>
       </w:r>
       <w:proofErr w:type="spellStart"/>
       <w:r>
@@ -24140,21 +24022,7 @@
           <w:sz w:val="32"/>
           <w:szCs w:val="32"/>
         </w:rPr>
-        <w:t xml:space="preserve"> variable </w:t>
-      </w:r>
-      <w:r>
-        <w:rPr>
-          <w:sz w:val="32"/>
-          <w:szCs w:val="32"/>
-        </w:rPr>
-        <w:t>reduces the</w:t>
-      </w:r>
-      <w:r>
-        <w:rPr>
-          <w:sz w:val="32"/>
-          <w:szCs w:val="32"/>
-        </w:rPr>
-        <w:t xml:space="preserve"> risk of reading </w:t>
+        <w:t xml:space="preserve"> variable reduces the risk of reading </w:t>
       </w:r>
       <w:r>
         <w:rPr>
@@ -24186,21 +24054,7 @@
           <w:sz w:val="32"/>
           <w:szCs w:val="32"/>
         </w:rPr>
-        <w:t xml:space="preserve">'s type system now forces </w:t>
-      </w:r>
-      <w:r>
-        <w:rPr>
-          <w:sz w:val="32"/>
-          <w:szCs w:val="32"/>
-        </w:rPr>
-        <w:t>us</w:t>
-      </w:r>
-      <w:r>
-        <w:rPr>
-          <w:sz w:val="32"/>
-          <w:szCs w:val="32"/>
-        </w:rPr>
-        <w:t xml:space="preserve"> to have it before </w:t>
+        <w:t xml:space="preserve">'s type system now forces us to have it before </w:t>
       </w:r>
       <w:proofErr w:type="spellStart"/>
       <w:proofErr w:type="gramStart"/>
@@ -24586,27 +24440,7 @@
           <w:sz w:val="32"/>
           <w:szCs w:val="32"/>
         </w:rPr>
-        <w:t>, //</w:t>
-      </w:r>
-      <w:r>
-        <w:rPr>
-          <w:b/>
-          <w:bCs/>
-          <w:color w:val="D86DCB" w:themeColor="accent5" w:themeTint="99"/>
-          <w:sz w:val="32"/>
-          <w:szCs w:val="32"/>
-        </w:rPr>
-        <w:t xml:space="preserve"> </w:t>
-      </w:r>
-      <w:r>
-        <w:rPr>
-          <w:b/>
-          <w:bCs/>
-          <w:color w:val="D86DCB" w:themeColor="accent5" w:themeTint="99"/>
-          <w:sz w:val="32"/>
-          <w:szCs w:val="32"/>
-        </w:rPr>
-        <w:t>flavor-specific Firebase config</w:t>
+        <w:t>, // flavor-specific Firebase config</w:t>
       </w:r>
     </w:p>
     <w:p>
@@ -24937,16 +24771,7 @@
           <w:sz w:val="32"/>
           <w:szCs w:val="32"/>
         </w:rPr>
-        <w:t>AppC</w:t>
-      </w:r>
-      <w:r>
-        <w:rPr>
-          <w:b/>
-          <w:bCs/>
-          <w:sz w:val="32"/>
-          <w:szCs w:val="32"/>
-        </w:rPr>
-        <w:t>onfig</w:t>
+        <w:t>AppConfig</w:t>
       </w:r>
       <w:proofErr w:type="spellEnd"/>
       <w:r>
@@ -26479,27 +26304,7 @@
           <w:sz w:val="32"/>
           <w:szCs w:val="32"/>
         </w:rPr>
-        <w:t>: 'flavors-staging', //</w:t>
-      </w:r>
-      <w:r>
-        <w:rPr>
-          <w:b/>
-          <w:bCs/>
-          <w:color w:val="D86DCB" w:themeColor="accent5" w:themeTint="99"/>
-          <w:sz w:val="32"/>
-          <w:szCs w:val="32"/>
-        </w:rPr>
-        <w:t xml:space="preserve"> </w:t>
-      </w:r>
-      <w:r>
-        <w:rPr>
-          <w:b/>
-          <w:bCs/>
-          <w:color w:val="D86DCB" w:themeColor="accent5" w:themeTint="99"/>
-          <w:sz w:val="32"/>
-          <w:szCs w:val="32"/>
-        </w:rPr>
-        <w:t>separate Firebase project</w:t>
+        <w:t>: 'flavors-staging', // separate Firebase project</w:t>
       </w:r>
     </w:p>
     <w:p>
@@ -26966,27 +26771,7 @@
           <w:sz w:val="32"/>
           <w:szCs w:val="32"/>
         </w:rPr>
-        <w:t>: 'flavors-prod', //</w:t>
-      </w:r>
-      <w:r>
-        <w:rPr>
-          <w:b/>
-          <w:bCs/>
-          <w:color w:val="D86DCB" w:themeColor="accent5" w:themeTint="99"/>
-          <w:sz w:val="32"/>
-          <w:szCs w:val="32"/>
-        </w:rPr>
-        <w:t xml:space="preserve"> </w:t>
-      </w:r>
-      <w:r>
-        <w:rPr>
-          <w:b/>
-          <w:bCs/>
-          <w:color w:val="D86DCB" w:themeColor="accent5" w:themeTint="99"/>
-          <w:sz w:val="32"/>
-          <w:szCs w:val="32"/>
-        </w:rPr>
-        <w:t>separate Firebase project</w:t>
+        <w:t>: 'flavors-prod', // separate Firebase project</w:t>
       </w:r>
     </w:p>
     <w:p>
@@ -27397,21 +27182,7 @@
           <w:sz w:val="32"/>
           <w:szCs w:val="32"/>
         </w:rPr>
-        <w:t xml:space="preserve"> in each </w:t>
-      </w:r>
-      <w:r>
-        <w:rPr>
-          <w:sz w:val="32"/>
-          <w:szCs w:val="32"/>
-        </w:rPr>
-        <w:t>F</w:t>
-      </w:r>
-      <w:r>
-        <w:rPr>
-          <w:sz w:val="32"/>
-          <w:szCs w:val="32"/>
-        </w:rPr>
-        <w:t>lavor folder</w:t>
+        <w:t xml:space="preserve"> in each Flavor folder</w:t>
       </w:r>
     </w:p>
     <w:p>
@@ -27701,21 +27472,7 @@
           <w:sz w:val="32"/>
           <w:szCs w:val="32"/>
         </w:rPr>
-        <w:t>Real team</w:t>
-      </w:r>
-      <w:r>
-        <w:rPr>
-          <w:sz w:val="32"/>
-          <w:szCs w:val="32"/>
-        </w:rPr>
-        <w:t>’</w:t>
-      </w:r>
-      <w:r>
-        <w:rPr>
-          <w:sz w:val="32"/>
-          <w:szCs w:val="32"/>
-        </w:rPr>
-        <w:t>s version-control their icon source files (e.g. a design/icons/ folder with Figma exports) so regenerating all five mipmap sizes per flavor is a scripted/automated step, not manual resizing every time</w:t>
+        <w:t>Real team’s version-control their icon source files (e.g. a design/icons/ folder with Figma exports) so regenerating all five mipmap sizes per flavor is a scripted/automated step, not manual resizing every time</w:t>
       </w:r>
     </w:p>
     <w:p>
@@ -28915,9 +28672,16 @@
           <w:sz w:val="32"/>
           <w:szCs w:val="32"/>
         </w:rPr>
-        <w:t>lavor's a</w:t>
-      </w:r>
-      <w:proofErr w:type="spellStart"/>
+        <w:t xml:space="preserve">lavor's </w:t>
+      </w:r>
+      <w:proofErr w:type="spellStart"/>
+      <w:r>
+        <w:rPr>
+          <w:sz w:val="32"/>
+          <w:szCs w:val="32"/>
+        </w:rPr>
+        <w:t>a</w:t>
+      </w:r>
       <w:r>
         <w:rPr>
           <w:b/>
@@ -31369,16 +31133,7 @@
           <w:sz w:val="32"/>
           <w:szCs w:val="32"/>
         </w:rPr>
-        <w:t>Firebase.</w:t>
-      </w:r>
-      <w:r>
-        <w:rPr>
-          <w:b/>
-          <w:bCs/>
-          <w:sz w:val="32"/>
-          <w:szCs w:val="32"/>
-        </w:rPr>
-        <w:t>initializeApp</w:t>
+        <w:t>Firebase.initializeApp</w:t>
       </w:r>
       <w:proofErr w:type="spellEnd"/>
       <w:r>
@@ -35135,6 +34890,7 @@
   <w:style w:type="character" w:default="1" w:styleId="DefaultParagraphFont">
     <w:name w:val="Default Paragraph Font"/>
     <w:uiPriority w:val="1"/>
+    <w:semiHidden/>
     <w:unhideWhenUsed/>
   </w:style>
   <w:style w:type="table" w:default="1" w:styleId="TableNormal">

</xml_diff>